<commit_message>
Update final short report with Hong Haoran individual contribution
Fill member 2 header and Individual contribution and reflection section in the group report template.

Co-authored-by: Cursor <cursoragent@cursor.com>
</commit_message>
<xml_diff>
--- a/Final Short Report Template.docx
+++ b/Final Short Report Template.docx
@@ -100,7 +100,7 @@
           <w:p>
             <w:pPr>
               <w:rPr>
-                <w:rFonts w:ascii="Times New Roman" w:hAnsi="Times New Roman" w:cs="Times New Roman"/>
+                <w:rFonts w:ascii="Times New Roman" w:hAnsi="Times New Roman" w:cs="Times New Roman" w:hint="eastAsia"/>
               </w:rPr>
             </w:pPr>
             <w:r>
@@ -138,7 +138,7 @@
           <w:p>
             <w:pPr>
               <w:rPr>
-                <w:rFonts w:ascii="Times New Roman" w:hAnsi="Times New Roman" w:cs="Times New Roman"/>
+                <w:rFonts w:ascii="Times New Roman" w:hAnsi="Times New Roman" w:cs="Times New Roman" w:hint="eastAsia"/>
               </w:rPr>
             </w:pPr>
             <w:r>
@@ -162,7 +162,7 @@
           <w:p>
             <w:pPr>
               <w:rPr>
-                <w:rFonts w:ascii="Times New Roman" w:hAnsi="Times New Roman" w:cs="Times New Roman"/>
+                <w:rFonts w:ascii="Times New Roman" w:hAnsi="Times New Roman" w:cs="Times New Roman" w:hint="eastAsia"/>
               </w:rPr>
             </w:pPr>
             <w:r>
@@ -212,20 +212,14 @@
           <w:p>
             <w:pPr>
               <w:rPr>
-                <w:rFonts w:ascii="Times New Roman" w:hAnsi="Times New Roman" w:cs="Times New Roman" w:hint="eastAsia"/>
+                <w:rFonts w:ascii="Times New Roman" w:hAnsi="Times New Roman" w:cs="Times New Roman"/>
               </w:rPr>
             </w:pPr>
             <w:r>
               <w:rPr>
                 <w:rFonts w:ascii="Times New Roman" w:hAnsi="Times New Roman" w:cs="Times New Roman"/>
               </w:rPr>
-              <w:t xml:space="preserve">QM no: </w:t>
-            </w:r>
-            <w:r>
-              <w:rPr>
-                <w:rFonts w:ascii="Times New Roman" w:hAnsi="Times New Roman" w:cs="Times New Roman" w:hint="eastAsia"/>
-              </w:rPr>
-              <w:t>231225823</w:t>
+              <w:t xml:space="preserve">QM no: 231225834</w:t>
             </w:r>
           </w:p>
         </w:tc>
@@ -243,13 +237,7 @@
               <w:rPr>
                 <w:rFonts w:ascii="Times New Roman" w:hAnsi="Times New Roman" w:cs="Times New Roman"/>
               </w:rPr>
-              <w:t>Name:</w:t>
-            </w:r>
-            <w:r>
-              <w:rPr>
-                <w:rFonts w:ascii="Times New Roman" w:hAnsi="Times New Roman" w:cs="Times New Roman" w:hint="eastAsia"/>
-              </w:rPr>
-              <w:t xml:space="preserve"> Sun Haixin</w:t>
+              <w:t>Name: Hong Haoran</w:t>
             </w:r>
             <w:r>
               <w:rPr>
@@ -847,7 +835,7 @@
     <w:p>
       <w:pPr>
         <w:rPr>
-          <w:rFonts w:ascii="Times New Roman" w:hAnsi="Times New Roman" w:cs="Times New Roman"/>
+          <w:rFonts w:ascii="Times New Roman" w:hAnsi="Times New Roman" w:cs="Times New Roman" w:hint="eastAsia"/>
           <w:lang w:val="en-US"/>
         </w:rPr>
       </w:pPr>
@@ -1330,7 +1318,7 @@
         </w:numPr>
         <w:ind w:left="927"/>
         <w:rPr>
-          <w:rFonts w:ascii="Times New Roman" w:hAnsi="Times New Roman" w:cs="Times New Roman"/>
+          <w:rFonts w:ascii="Times New Roman" w:hAnsi="Times New Roman" w:cs="Times New Roman" w:hint="eastAsia"/>
           <w:lang w:val="en-US"/>
         </w:rPr>
       </w:pPr>
@@ -1407,7 +1395,7 @@
         </w:numPr>
         <w:ind w:left="927"/>
         <w:rPr>
-          <w:rFonts w:ascii="Times New Roman" w:hAnsi="Times New Roman" w:cs="Times New Roman"/>
+          <w:rFonts w:ascii="Times New Roman" w:hAnsi="Times New Roman" w:cs="Times New Roman" w:hint="eastAsia"/>
           <w:lang w:val="en-US"/>
         </w:rPr>
       </w:pPr>
@@ -1738,7 +1726,7 @@
     <w:p>
       <w:pPr>
         <w:rPr>
-          <w:rFonts w:ascii="Times New Roman" w:hAnsi="Times New Roman" w:cs="Times New Roman"/>
+          <w:rFonts w:ascii="Times New Roman" w:hAnsi="Times New Roman" w:cs="Times New Roman" w:hint="eastAsia"/>
           <w:lang w:val="en-US"/>
         </w:rPr>
       </w:pPr>
@@ -2301,7 +2289,7 @@
         <w:rPr>
           <w:rFonts w:ascii="Times New Roman" w:hAnsi="Times New Roman" w:cs="Times New Roman"/>
         </w:rPr>
-        <w:t>QM no:</w:t>
+        <w:t>QM no: 231225834</w:t>
       </w:r>
       <w:r>
         <w:rPr>
@@ -2320,7 +2308,7 @@
         <w:rPr>
           <w:rFonts w:ascii="Times New Roman" w:hAnsi="Times New Roman" w:cs="Times New Roman"/>
         </w:rPr>
-        <w:t>Name:</w:t>
+        <w:t>Name: Hong Haoran</w:t>
       </w:r>
       <w:r>
         <w:rPr>
@@ -2339,7 +2327,7 @@
         <w:rPr>
           <w:rFonts w:ascii="Times New Roman" w:hAnsi="Times New Roman" w:cs="Times New Roman"/>
         </w:rPr>
-        <w:t>Main contribution:</w:t>
+        <w:t>Main contribution: I was primarily responsible for the TA-side job module (ta_jobs/) and the advanced TA-12 AI Diagnosis feature. My work covered TAJobService and TAJobsUI for browsing open positions, semester-aware filtering (CurrentSemesterStore and PositionSemesterStore), duplicate-application prevention, and integration with the Home2 search bar. I implemented TA-12 end-to-end: CV text extraction from uploaded PDF/DOCX files (CvTextExtractor), skill indexing from CV and profile data (ApplicantSkillIndex), keyword-based matching against open positions (AiDiagnosisService), and the recommendation UI (AiDiagnosisUI) with match scores and reasons. I also added PositionDetailUI so TAs can double-click a job row to open a full-page detail view and apply directly, wired through RecruitmentSystemContext and the TA homepage AI Diagnosis entry. I resolved portable CV path resolution (CvPathResolver) when uploaded files are stored locally, and delivered the work through branches Honghaoran_aidiagnose and Honghaoran_jobdiscribtion, which were merged into main.</w:t>
       </w:r>
       <w:r>
         <w:rPr>
@@ -2358,7 +2346,7 @@
         <w:rPr>
           <w:rFonts w:ascii="Times New Roman" w:hAnsi="Times New Roman" w:cs="Times New Roman"/>
         </w:rPr>
-        <w:t>Reflective statement:</w:t>
+        <w:t>Reflective statement: This project improved my ability to extend an existing layered Java/Swing codebase without breaking other modules. The biggest challenge was implementing TA-12 without external AI libraries or databases: CV parsing had to work with plain Java, and matching quality depended on uploaded CV content and profile skills. Debugging CV file missing errors taught me the difference between persisted paths in users.csv and actual files on disk, especially after Git pulls. Integrating new UI flows into Home2 also required careful reuse of TAJobService rather than duplicating business rules. Overall, I developed stronger skills in requirement-driven design, incremental delivery through Git branches and pull requests, and writing user-facing error messages that guide recovery. Working in a team repository further reinforced service/repository separation and keeping TA job logic inside ta_jobs/.</w:t>
       </w:r>
       <w:r>
         <w:rPr>

</xml_diff>